<commit_message>
Retail Sales Analytics doc
</commit_message>
<xml_diff>
--- a/docs/Retail_Sales_Analytics_Report.docx
+++ b/docs/Retail_Sales_Analytics_Report.docx
@@ -259,7 +259,7 @@
           <w:sz w:val="24"/>
           <w:szCs w:val="24"/>
         </w:rPr>
-        <w:t>Visualise (Tableau)</w:t>
+        <w:t>Visualization (Tableau)</w:t>
       </w:r>
     </w:p>
     <w:p>
@@ -296,51 +296,23 @@
     </w:p>
     <w:p>
       <w:pPr>
+        <w:pStyle w:val="NoSpacing"/>
+        <w:rPr>
+          <w:rFonts w:ascii="Times New Roman" w:eastAsia="Times New Roman" w:hAnsi="Times New Roman" w:cs="Times New Roman"/>
+          <w:sz w:val="24"/>
+          <w:szCs w:val="24"/>
+          <w:lang w:eastAsia="en-IN"/>
+        </w:rPr>
+      </w:pPr>
+      <w:r>
         <w:rPr>
           <w:rFonts w:ascii="Times New Roman" w:hAnsi="Times New Roman" w:cs="Times New Roman"/>
           <w:sz w:val="24"/>
           <w:szCs w:val="24"/>
           <w:lang w:eastAsia="en-IN"/>
         </w:rPr>
-      </w:pPr>
-      <w:r>
-        <w:rPr>
-          <w:rFonts w:ascii="Times New Roman" w:hAnsi="Times New Roman" w:cs="Times New Roman"/>
-          <w:sz w:val="24"/>
-          <w:szCs w:val="24"/>
-          <w:lang w:eastAsia="en-IN"/>
-        </w:rPr>
-        <w:t xml:space="preserve">To </w:t>
-      </w:r>
-      <w:r>
-        <w:rPr>
-          <w:rFonts w:ascii="Times New Roman" w:hAnsi="Times New Roman" w:cs="Times New Roman"/>
-          <w:sz w:val="24"/>
-          <w:szCs w:val="24"/>
-          <w:lang w:eastAsia="en-IN"/>
-        </w:rPr>
-        <w:t>analyse</w:t>
-      </w:r>
-      <w:r>
-        <w:rPr>
-          <w:rFonts w:ascii="Times New Roman" w:hAnsi="Times New Roman" w:cs="Times New Roman"/>
-          <w:sz w:val="24"/>
-          <w:szCs w:val="24"/>
-          <w:lang w:eastAsia="en-IN"/>
-        </w:rPr>
-        <w:t xml:space="preserve"> retail sales data, validate AI-generated SQL, ensure data quality, and create business insights.</w:t>
-      </w:r>
-    </w:p>
-    <w:p>
-      <w:pPr>
-        <w:pStyle w:val="NoSpacing"/>
-        <w:rPr>
-          <w:rFonts w:ascii="Times New Roman" w:eastAsia="Times New Roman" w:hAnsi="Times New Roman" w:cs="Times New Roman"/>
-          <w:sz w:val="24"/>
-          <w:szCs w:val="24"/>
-          <w:lang w:eastAsia="en-IN"/>
-        </w:rPr>
-      </w:pPr>
+        <w:t>To develop a retail analytics solution that validates AI-generated SQL queries against manually written logic, ensuring data accuracy and uncovering profitability issues through structured analysis.</w:t>
+      </w:r>
       <w:r>
         <w:rPr>
           <w:rFonts w:ascii="Times New Roman" w:eastAsia="Times New Roman" w:hAnsi="Times New Roman" w:cs="Times New Roman"/>
@@ -7610,6 +7582,39 @@
     <w:p>
       <w:pPr>
         <w:pStyle w:val="NoSpacing"/>
+        <w:numPr>
+          <w:ilvl w:val="0"/>
+          <w:numId w:val="31"/>
+        </w:numPr>
+        <w:rPr>
+          <w:rFonts w:ascii="Times New Roman" w:eastAsia="Times New Roman" w:hAnsi="Times New Roman" w:cs="Times New Roman"/>
+          <w:sz w:val="24"/>
+          <w:szCs w:val="24"/>
+          <w:lang w:eastAsia="en-IN"/>
+        </w:rPr>
+      </w:pPr>
+      <w:r>
+        <w:rPr>
+          <w:rFonts w:ascii="Times New Roman" w:eastAsia="Times New Roman" w:hAnsi="Times New Roman" w:cs="Times New Roman"/>
+          <w:sz w:val="24"/>
+          <w:szCs w:val="24"/>
+          <w:lang w:eastAsia="en-IN"/>
+        </w:rPr>
+        <w:t>These findings highlight that revenue alone is not a reliable in</w:t>
+      </w:r>
+      <w:r>
+        <w:rPr>
+          <w:rFonts w:ascii="Times New Roman" w:eastAsia="Times New Roman" w:hAnsi="Times New Roman" w:cs="Times New Roman"/>
+          <w:sz w:val="24"/>
+          <w:szCs w:val="24"/>
+          <w:lang w:eastAsia="en-IN"/>
+        </w:rPr>
+        <w:t>dicator of business performance</w:t>
+      </w:r>
+    </w:p>
+    <w:p>
+      <w:pPr>
+        <w:pStyle w:val="NoSpacing"/>
         <w:ind w:left="720"/>
         <w:rPr>
           <w:rFonts w:ascii="Times New Roman" w:eastAsia="Times New Roman" w:hAnsi="Times New Roman" w:cs="Times New Roman"/>
@@ -7700,6 +7705,7 @@
           <w:sz w:val="24"/>
           <w:szCs w:val="24"/>
         </w:rPr>
+        <w:lastRenderedPageBreak/>
         <w:t xml:space="preserve">A combined Sales </w:t>
       </w:r>
       <w:r>
@@ -7756,7 +7762,6 @@
           <w:szCs w:val="28"/>
           <w:lang w:eastAsia="en-IN"/>
         </w:rPr>
-        <w:lastRenderedPageBreak/>
         <w:t>Visuals Created:</w:t>
       </w:r>
     </w:p>
@@ -8061,8 +8066,6 @@
         </w:rPr>
         <w:t>(Line Chart)</w:t>
       </w:r>
-      <w:bookmarkStart w:id="0" w:name="_GoBack"/>
-      <w:bookmarkEnd w:id="0"/>
     </w:p>
     <w:p>
       <w:pPr>
@@ -8274,6 +8277,7 @@
           <w:szCs w:val="24"/>
           <w:lang w:eastAsia="en-IN"/>
         </w:rPr>
+        <w:lastRenderedPageBreak/>
         <w:t>Profit</w:t>
       </w:r>
       <w:r>
@@ -8307,7 +8311,6 @@
           <w:szCs w:val="24"/>
           <w:lang w:eastAsia="en-IN"/>
         </w:rPr>
-        <w:lastRenderedPageBreak/>
         <w:t>This chart compares positive and negative profit across categories, highlighting segments contributing to overall losses</w:t>
       </w:r>
     </w:p>
@@ -8677,6 +8680,28 @@
     <w:p>
       <w:pPr>
         <w:pStyle w:val="NoSpacing"/>
+        <w:rPr>
+          <w:rFonts w:ascii="Times New Roman" w:eastAsia="Times New Roman" w:hAnsi="Times New Roman" w:cs="Times New Roman"/>
+          <w:sz w:val="24"/>
+          <w:szCs w:val="24"/>
+          <w:lang w:eastAsia="en-IN"/>
+        </w:rPr>
+      </w:pPr>
+      <w:bookmarkStart w:id="0" w:name="_GoBack"/>
+      <w:bookmarkEnd w:id="0"/>
+      <w:r>
+        <w:rPr>
+          <w:rFonts w:ascii="Times New Roman" w:eastAsia="Times New Roman" w:hAnsi="Times New Roman" w:cs="Times New Roman"/>
+          <w:sz w:val="24"/>
+          <w:szCs w:val="24"/>
+          <w:lang w:eastAsia="en-IN"/>
+        </w:rPr>
+        <w:t>This project demonstrates:</w:t>
+      </w:r>
+    </w:p>
+    <w:p>
+      <w:pPr>
+        <w:pStyle w:val="NoSpacing"/>
         <w:numPr>
           <w:ilvl w:val="0"/>
           <w:numId w:val="33"/>
@@ -8695,7 +8720,7 @@
           <w:szCs w:val="24"/>
           <w:lang w:eastAsia="en-IN"/>
         </w:rPr>
-        <w:t>This project demonstrates:</w:t>
+        <w:t>Strong SQL skills</w:t>
       </w:r>
     </w:p>
     <w:p>
@@ -8719,7 +8744,7 @@
           <w:szCs w:val="24"/>
           <w:lang w:eastAsia="en-IN"/>
         </w:rPr>
-        <w:t>Strong SQL skills</w:t>
+        <w:t>Data modeling in Snowflake</w:t>
       </w:r>
     </w:p>
     <w:p>
@@ -8743,7 +8768,7 @@
           <w:szCs w:val="24"/>
           <w:lang w:eastAsia="en-IN"/>
         </w:rPr>
-        <w:t>Data modeling in Snowflake</w:t>
+        <w:t>AI-assisted analytics and validation</w:t>
       </w:r>
     </w:p>
     <w:p>
@@ -8767,7 +8792,7 @@
           <w:szCs w:val="24"/>
           <w:lang w:eastAsia="en-IN"/>
         </w:rPr>
-        <w:t>AI-assisted analytics and validation</w:t>
+        <w:t>Data quality analysis</w:t>
       </w:r>
     </w:p>
     <w:p>
@@ -8791,7 +8816,7 @@
           <w:szCs w:val="24"/>
           <w:lang w:eastAsia="en-IN"/>
         </w:rPr>
-        <w:t>Data quality analysis</w:t>
+        <w:t>Business insight generation</w:t>
       </w:r>
     </w:p>
     <w:p>
@@ -8815,40 +8840,7 @@
           <w:szCs w:val="24"/>
           <w:lang w:eastAsia="en-IN"/>
         </w:rPr>
-        <w:t>Business insight generation</w:t>
-      </w:r>
-    </w:p>
-    <w:p>
-      <w:pPr>
-        <w:pStyle w:val="NoSpacing"/>
-        <w:numPr>
-          <w:ilvl w:val="0"/>
-          <w:numId w:val="33"/>
-        </w:numPr>
-        <w:rPr>
-          <w:rFonts w:ascii="Times New Roman" w:eastAsia="Times New Roman" w:hAnsi="Times New Roman" w:cs="Times New Roman"/>
-          <w:sz w:val="24"/>
-          <w:szCs w:val="24"/>
-          <w:lang w:eastAsia="en-IN"/>
-        </w:rPr>
-      </w:pPr>
-      <w:r>
-        <w:rPr>
-          <w:rFonts w:ascii="Times New Roman" w:eastAsia="Times New Roman" w:hAnsi="Times New Roman" w:cs="Times New Roman"/>
-          <w:sz w:val="24"/>
-          <w:szCs w:val="24"/>
-          <w:lang w:eastAsia="en-IN"/>
-        </w:rPr>
-        <w:t>Dashboard</w:t>
-      </w:r>
-      <w:r>
-        <w:rPr>
-          <w:rFonts w:ascii="Times New Roman" w:eastAsia="Times New Roman" w:hAnsi="Times New Roman" w:cs="Times New Roman"/>
-          <w:sz w:val="24"/>
-          <w:szCs w:val="24"/>
-          <w:lang w:eastAsia="en-IN"/>
-        </w:rPr>
-        <w:t xml:space="preserve"> capability</w:t>
+        <w:t>Data visualization and dashboard development capability</w:t>
       </w:r>
     </w:p>
     <w:p>

</xml_diff>